<commit_message>
Análisis EDIFICIO DE MOLIENDA corregido (Df=1.5m a 4.0m)
Parámetros actualizados:
- Estratos: [2.15m, 2.25m, 10.0m]
- Módulos E: [5, 12, 50] MPa
- Profundidad total: 14.40m
- Zapata: 6.0m × 8.0m × 1.0m
- Carga: 6,288 kN

Resultados:
- Df=1.5m: 24.55 mm
- Df=2.0m: 19.70 mm
- Df=2.5m: 16.55 mm
- Df=3.0m: 14.36 mm
- Df=3.5m: 12.13 mm
- Df=4.0m: 10.21 mm

Reducción: 58.4% (Df=1.5m a Df=4.0m)

Incluye:
- 6 reportes PDF completos
- Documento Word comparativo
- Datos de análisis FEM
- Gráficos y visualizaciones
</commit_message>
<xml_diff>
--- a/Analisis_Comparativo_Df.docx
+++ b/Analisis_Comparativo_Df.docx
@@ -203,7 +203,7 @@
               <w:jc w:val="center"/>
             </w:pPr>
             <w:r>
-              <w:t>54.81</w:t>
+              <w:t>24.55</w:t>
             </w:r>
           </w:p>
         </w:tc>
@@ -254,7 +254,7 @@
               <w:jc w:val="center"/>
             </w:pPr>
             <w:r>
-              <w:t>50.71</w:t>
+              <w:t>19.70</w:t>
             </w:r>
           </w:p>
         </w:tc>
@@ -267,7 +267,7 @@
               <w:jc w:val="center"/>
             </w:pPr>
             <w:r>
-              <w:t>7.5%</w:t>
+              <w:t>19.8%</w:t>
             </w:r>
           </w:p>
         </w:tc>
@@ -305,7 +305,7 @@
               <w:jc w:val="center"/>
             </w:pPr>
             <w:r>
-              <w:t>47.00</w:t>
+              <w:t>16.55</w:t>
             </w:r>
           </w:p>
         </w:tc>
@@ -318,7 +318,7 @@
               <w:jc w:val="center"/>
             </w:pPr>
             <w:r>
-              <w:t>14.3%</w:t>
+              <w:t>32.6%</w:t>
             </w:r>
           </w:p>
         </w:tc>
@@ -328,7 +328,7 @@
           </w:tcPr>
           <w:p>
             <w:r>
-              <w:t>Reducción moderada</w:t>
+              <w:t>Reducción significativa</w:t>
             </w:r>
           </w:p>
         </w:tc>
@@ -356,7 +356,7 @@
               <w:jc w:val="center"/>
             </w:pPr>
             <w:r>
-              <w:t>43.10</w:t>
+              <w:t>14.36</w:t>
             </w:r>
           </w:p>
         </w:tc>
@@ -369,7 +369,7 @@
               <w:jc w:val="center"/>
             </w:pPr>
             <w:r>
-              <w:t>21.4%</w:t>
+              <w:t>41.5%</w:t>
             </w:r>
           </w:p>
         </w:tc>
@@ -407,7 +407,7 @@
               <w:jc w:val="center"/>
             </w:pPr>
             <w:r>
-              <w:t>39.06</w:t>
+              <w:t>12.13</w:t>
             </w:r>
           </w:p>
         </w:tc>
@@ -420,7 +420,7 @@
               <w:jc w:val="center"/>
             </w:pPr>
             <w:r>
-              <w:t>28.7%</w:t>
+              <w:t>50.6%</w:t>
             </w:r>
           </w:p>
         </w:tc>
@@ -458,7 +458,7 @@
               <w:jc w:val="center"/>
             </w:pPr>
             <w:r>
-              <w:t>35.27</w:t>
+              <w:t>10.21</w:t>
             </w:r>
           </w:p>
         </w:tc>
@@ -471,7 +471,7 @@
               <w:jc w:val="center"/>
             </w:pPr>
             <w:r>
-              <w:t>35.6%</w:t>
+              <w:t>58.4%</w:t>
             </w:r>
           </w:p>
         </w:tc>
@@ -503,7 +503,7 @@
       <w:r>
         <w:drawing>
           <wp:inline xmlns:a="http://schemas.openxmlformats.org/drawingml/2006/main" xmlns:pic="http://schemas.openxmlformats.org/drawingml/2006/picture">
-            <wp:extent cx="5486400" cy="3263334"/>
+            <wp:extent cx="5486400" cy="3264436"/>
             <wp:docPr id="1" name="Picture 1"/>
             <wp:cNvGraphicFramePr>
               <a:graphicFrameLocks noChangeAspect="1"/>
@@ -524,7 +524,7 @@
                   <pic:spPr>
                     <a:xfrm>
                       <a:off x="0" y="0"/>
-                      <a:ext cx="5486400" cy="3263334"/>
+                      <a:ext cx="5486400" cy="3264436"/>
                     </a:xfrm>
                     <a:prstGeom prst="rect"/>
                   </pic:spPr>
@@ -559,7 +559,7 @@
     </w:p>
     <w:p>
       <w:r>
-        <w:t>El análisis comparativo de diferentes profundidades de desplante (Df) para el EDIFICIO DE MOLIENDA muestra una tendencia clara: a mayor profundidad de desplante, menor es el asentamiento por carga incremental. El rango de asentamientos va desde 54.81 mm (Df=1.5m) hasta 35.27 mm (Df=4.0m), representando una reducción de 35.6% al aumentar la profundidad de desplante.</w:t>
+        <w:t>El análisis comparativo de diferentes profundidades de desplante (Df) para el EDIFICIO DE MOLIENDA muestra una tendencia clara: a mayor profundidad de desplante, menor es el asentamiento por carga incremental. El rango de asentamientos va desde 24.55 mm (Df=1.5m) hasta 10.21 mm (Df=4.0m), representando una reducción de 58.4% al aumentar la profundidad de desplante.</w:t>
       </w:r>
     </w:p>
     <w:p>
@@ -573,7 +573,7 @@
     </w:p>
     <w:p>
       <w:r>
-        <w:t>La profundidad de desplante óptima para minimizar asentamientos es Df=4.0m, con un asentamiento de 35.27 mm en el centro de la zapata durante la fase de carga. Este valor representa el mejor desempeño entre todas las configuraciones analizadas.</w:t>
+        <w:t>La profundidad de desplante óptima para minimizar asentamientos es Df=4.0m, con un asentamiento de 10.21 mm en el centro de la zapata durante la fase de carga. Este valor representa el mejor desempeño entre todas las configuraciones analizadas.</w:t>
       </w:r>
     </w:p>
     <w:p>
@@ -636,7 +636,7 @@
         <w:pStyle w:val="ListNumber"/>
       </w:pPr>
       <w:r>
-        <w:t>La profundidad de desplante tiene un efecto significativo en el asentamiento de la zapata, con una reducción de hasta 35.6% al pasar de Df=1.5m a Df=4.0m.</w:t>
+        <w:t>La profundidad de desplante tiene un efecto significativo en el asentamiento de la zapata, con una reducción de hasta 58.4% al pasar de Df=1.5m a Df=4.0m.</w:t>
       </w:r>
     </w:p>
     <w:p>
@@ -644,7 +644,7 @@
         <w:pStyle w:val="ListNumber"/>
       </w:pPr>
       <w:r>
-        <w:t>El desempeño óptimo se obtiene con Df=4.0m, alcanzando un asentamiento de 35.27 mm en el centro de la zapata durante la aplicación de carga.</w:t>
+        <w:t>El desempeño óptimo se obtiene con Df=4.0m, alcanzando un asentamiento de 10.21 mm en el centro de la zapata durante la aplicación de carga.</w:t>
       </w:r>
     </w:p>
     <w:p>

</xml_diff>